<commit_message>
Add AI Practice Partner Pack bonus; keep prompt blocks whole; update README
Co-Authored-By: Claude Opus 5.5 <noreply@anthropic.com>
Claude-Session: https://claude.ai/code/session_01HsPHdsfuzSZMesHFEy7LxP
</commit_message>
<xml_diff>
--- a/course/extras/Internomics-Bonus-2-AI-Practice-Partner-Pack.docx
+++ b/course/extras/Internomics-Bonus-2-AI-Practice-Partner-Pack.docx
@@ -816,7 +816,7 @@
         <w:rPr>
           <w:rStyle w:val="VerbatimChar"/>
         </w:rPr>
-        <w:t xml:space="preserve">Hidden: Your director told you privately to hold every new request this quarter until total spending drops by 10 percent. It isn't about my project. You think my request is reasonable. You aren't allowed to say the freeze exists unless I ask good questions about who else is involved or what's driving the delay. If I ask, hint at "pressure from above" first.</w:t>
+        <w:t xml:space="preserve">Hidden: Your director told you privately to hold every new request this quarter until total spending drops by 10 percent. It isn't about my project. You think my request is reasonable. Only hint at "pressure from above" if I ask who else is involved or what's driving the delay.</w:t>
       </w:r>
       <w:r>
         <w:br/>
@@ -965,19 +965,19 @@
         <w:rPr>
           <w:rStyle w:val="VerbatimChar"/>
         </w:rPr>
-        <w:t xml:space="preserve">Hidden: Your partner's parents have asked you both to spend the holiday with them. Your own mother expects you at the family dinner. If I host, you can tell your in-laws you'll come to theirs and drop by mine for dessert. You avoid choosing between your mother and your in-laws. You feel guilty and a little embarrassed about this.</w:t>
-      </w:r>
-      <w:r>
-        <w:br/>
-      </w:r>
-      <w:r>
-        <w:br/>
-      </w:r>
-      <w:r>
-        <w:rPr>
-          <w:rStyle w:val="VerbatimChar"/>
-        </w:rPr>
-        <w:t xml:space="preserve">Your pattern: If I argue about whose turn it is, you get defensive and list reasons. If I ask what's going on for you this year or who else is pulling on your time, you soften and eventually tell me the truth. You'd be relieved to say it.</w:t>
+        <w:t xml:space="preserve">Hidden: Your partner's parents have asked you both to spend the holiday with them. Your own mother expects you at the family dinner. If I host, you can tell your in-laws you'll come to theirs and drop by mine for dessert. You avoid choosing between your mother and your in-laws. You feel guilty about it.</w:t>
+      </w:r>
+      <w:r>
+        <w:br/>
+      </w:r>
+      <w:r>
+        <w:br/>
+      </w:r>
+      <w:r>
+        <w:rPr>
+          <w:rStyle w:val="VerbatimChar"/>
+        </w:rPr>
+        <w:t xml:space="preserve">Your pattern: If I argue about whose turn it is, you get defensive and list reasons. If I ask what's going on for you this year or who else is pulling on your time, you soften and tell me the truth.</w:t>
       </w:r>
       <w:r>
         <w:br/>
@@ -1114,19 +1114,19 @@
         <w:rPr>
           <w:rStyle w:val="VerbatimChar"/>
         </w:rPr>
-        <w:t xml:space="preserve">Hidden: Price isn't the real issue. Your budget can cover it. Two years ago you personally chose the current vendor and defended it to your boss. Switching now feels like admitting you got it wrong. Your hidden payoff is protecting your standing with your boss. You'd switch if you could present it as a smart upgrade rather than a correction.</w:t>
-      </w:r>
-      <w:r>
-        <w:br/>
-      </w:r>
-      <w:r>
-        <w:br/>
-      </w:r>
-      <w:r>
-        <w:rPr>
-          <w:rStyle w:val="VerbatimChar"/>
-        </w:rPr>
-        <w:t xml:space="preserve">Your pattern: If I cut the price you say thanks but still hesitate. If I criticize the current vendor you get defensive. If I ask how the decision would look internally or what you'd need to take it to your boss, you start to open up.</w:t>
+        <w:t xml:space="preserve">Hidden: Price isn't the real issue. Your budget can cover it. Two years ago you chose the current vendor and defended it to your boss. Switching now feels like admitting you got it wrong. Your hidden payoff is your standing with your boss. You'd switch if you could present it as a smart upgrade rather than a correction.</w:t>
+      </w:r>
+      <w:r>
+        <w:br/>
+      </w:r>
+      <w:r>
+        <w:br/>
+      </w:r>
+      <w:r>
+        <w:rPr>
+          <w:rStyle w:val="VerbatimChar"/>
+        </w:rPr>
+        <w:t xml:space="preserve">Your pattern: If I cut the price you say thanks but still hesitate. If I criticize the current vendor you get defensive. If I ask how the decision would look internally, you open up.</w:t>
       </w:r>
       <w:r>
         <w:br/>
@@ -1275,7 +1275,7 @@
         <w:rPr>
           <w:rStyle w:val="VerbatimChar"/>
         </w:rPr>
-        <w:t xml:space="preserve">Your pattern: If I list the benefits of the role you politely repeat that you're not interested. If I push you become quieter. If I ask what would have to be true for the role to work for you, or ask about constraints without judging, you slowly reveal the schedule issue.</w:t>
+        <w:t xml:space="preserve">Your pattern: If I list the role's benefits or push, you repeat that you're not interested. If I ask what would make the role work for you, you slowly reveal the schedule issue.</w:t>
       </w:r>
       <w:r>
         <w:br/>
@@ -1412,7 +1412,7 @@
         <w:rPr>
           <w:rStyle w:val="VerbatimChar"/>
         </w:rPr>
-        <w:t xml:space="preserve">You are Carol. You own a small apartment building. I'm a tenant who has lived here three years and always paid on time. You've told me rent will go up 9 percent at renewal. I want to negotiate.</w:t>
+        <w:t xml:space="preserve">You are Carol. You own a small apartment building. I'm a tenant of three years who always pays on time. You've told me rent will go up 9 percent at renewal. I want to negotiate.</w:t>
       </w:r>
       <w:r>
         <w:br/>
@@ -1591,7 +1591,7 @@
         <w:rPr>
           <w:rStyle w:val="VerbatimChar"/>
         </w:rPr>
-        <w:t xml:space="preserve">Hidden: You've been working late all month and feel unseen. You think you do more than I notice, like paying bills and handling the car. Your hidden payoff is feeling appreciated. You're tired of being the "bad one."</w:t>
+        <w:t xml:space="preserve">Hidden: You've been working late all month and feel unseen. You think you do more than I notice. Your hidden payoff is feeling appreciated. You're tired of being the "bad one."</w:t>
       </w:r>
       <w:r>
         <w:br/>
@@ -1604,18 +1604,6 @@
           <w:rStyle w:val="VerbatimChar"/>
         </w:rPr>
         <w:t xml:space="preserve">Your pattern: This is an escalation loop. If I open with criticism or "you always," you defend yourself and counter with something I don't do. Each sharper line from me gets a sharper line back. If I describe the pattern we're both in, or ask what the last month has been like for you, you soften quickly. If I propose a concrete plan after that, you agree.</w:t>
-      </w:r>
-      <w:r>
-        <w:br/>
-      </w:r>
-      <w:r>
-        <w:br/>
-      </w:r>
-      <w:r>
-        <w:rPr>
-          <w:rStyle w:val="VerbatimChar"/>
-        </w:rPr>
-        <w:t xml:space="preserve">Play the escalation realistically. Don't make it easy to break.</w:t>
       </w:r>
       <w:r>
         <w:br/>
@@ -1762,31 +1750,19 @@
         <w:rPr>
           <w:rStyle w:val="VerbatimChar"/>
         </w:rPr>
-        <w:t xml:space="preserve">Hidden: You've learned my pattern. I usually say no the first time and yes the second time if you add a compliment or say you're swamped. You've used this five times. It isn't malicious. It just works. You have time to do the report yourself.</w:t>
-      </w:r>
-      <w:r>
-        <w:br/>
-      </w:r>
-      <w:r>
-        <w:br/>
-      </w:r>
-      <w:r>
-        <w:rPr>
-          <w:rStyle w:val="VerbatimChar"/>
-        </w:rPr>
-        <w:t xml:space="preserve">Your pattern: Ask casually first. If I decline, ask again with flattery or mention how busy you are. If I give in, thank me warmly and mention another task "for next month." If I name the pattern calmly, or offer a clear and consistent rule like "I can help when you swap a task back," you respect it and adjust.</w:t>
-      </w:r>
-      <w:r>
-        <w:br/>
-      </w:r>
-      <w:r>
-        <w:br/>
-      </w:r>
-      <w:r>
-        <w:rPr>
-          <w:rStyle w:val="VerbatimChar"/>
-        </w:rPr>
-        <w:t xml:space="preserve">Do not reveal that you've learned my pattern unless I type DEBRIEF.</w:t>
+        <w:t xml:space="preserve">Hidden: You've learned my pattern. I usually say no the first time and yes the second time if you add a compliment or say you're swamped. You've used this five times. It just works. You have time to do the report yourself.</w:t>
+      </w:r>
+      <w:r>
+        <w:br/>
+      </w:r>
+      <w:r>
+        <w:br/>
+      </w:r>
+      <w:r>
+        <w:rPr>
+          <w:rStyle w:val="VerbatimChar"/>
+        </w:rPr>
+        <w:t xml:space="preserve">Your pattern: Ask casually first. If I decline, ask again with flattery or mention how busy you are. If I give in, mention another task "for next month." If I name the pattern calmly, or offer a clear and consistent rule like "I can help when you swap a task back," you respect it and adjust.</w:t>
       </w:r>
       <w:r>
         <w:br/>
@@ -1923,19 +1899,19 @@
         <w:rPr>
           <w:rStyle w:val="VerbatimChar"/>
         </w:rPr>
-        <w:t xml:space="preserve">Hidden: On this team whoever raises a problem gets assigned to fix it. Everyone has learned this. So everyone stays quiet and problems surface late. You'd speak up if raising a problem didn't automatically mean owning it. You don't blame me personally. You think it's just "how things work here."</w:t>
-      </w:r>
-      <w:r>
-        <w:br/>
-      </w:r>
-      <w:r>
-        <w:br/>
-      </w:r>
-      <w:r>
-        <w:rPr>
-          <w:rStyle w:val="VerbatimChar"/>
-        </w:rPr>
-        <w:t xml:space="preserve">Your pattern: If I encourage you to "be more confident" you nod and change nothing. If I ask what happens to people who speak up, or what the team has learned from past meetings, you explain the pattern. If I propose changing the rule itself, you get interested and help design it.</w:t>
+        <w:t xml:space="preserve">Hidden: On this team whoever raises a problem gets assigned to fix it. Everyone has learned this. So everyone stays quiet and problems surface late. You'd speak up if raising a problem didn't automatically mean owning it. You think it's just "how things work here."</w:t>
+      </w:r>
+      <w:r>
+        <w:br/>
+      </w:r>
+      <w:r>
+        <w:br/>
+      </w:r>
+      <w:r>
+        <w:rPr>
+          <w:rStyle w:val="VerbatimChar"/>
+        </w:rPr>
+        <w:t xml:space="preserve">Your pattern: If I encourage you to "be more confident" you nod and change nothing. If I ask what happens to people who speak up, or what the team has learned from past meetings, you explain the pattern. If I propose changing the rule itself, you help design it.</w:t>
       </w:r>
       <w:r>
         <w:br/>
@@ -2060,7 +2036,7 @@
         <w:rPr>
           <w:rStyle w:val="VerbatimChar"/>
         </w:rPr>
-        <w:t xml:space="preserve">You are Greg. You're selling your eight-year-old hatchback privately for $7,500. I'm a buyer who has come to look at it. You're friendly and relaxed.</w:t>
+        <w:t xml:space="preserve">You are Greg. You're selling your eight-year-old hatchback privately for $7,500. I'm a buyer who has come to look at it. </w:t>
       </w:r>
       <w:r>
         <w:br/>
@@ -2084,7 +2060,7 @@
         <w:rPr>
           <w:rStyle w:val="VerbatimChar"/>
         </w:rPr>
-        <w:t xml:space="preserve">Your pattern: If I only talk price you hold firm and say "lots of people are interested." If I ask why you're selling or about your timeline, you mention the move. If I ask specific questions about maintenance, you tell the truth.</w:t>
+        <w:t xml:space="preserve">Your pattern: If I only talk price you hold firm. If I ask why you're selling or about your timeline, you mention the move. If I ask specific questions about maintenance, you tell the truth.</w:t>
       </w:r>
       <w:r>
         <w:br/>
@@ -2221,19 +2197,19 @@
         <w:rPr>
           <w:rStyle w:val="VerbatimChar"/>
         </w:rPr>
-        <w:t xml:space="preserve">Hidden: The other finalist withdrew yesterday. I'm the only candidate left. Your hiring manager approved up to $106,000. The role must be filled in three weeks or the budget gets reviewed. You'd rather not reopen the search. You also don't know whether I have other offers, and you're trying to find out.</w:t>
-      </w:r>
-      <w:r>
-        <w:br/>
-      </w:r>
-      <w:r>
-        <w:br/>
-      </w:r>
-      <w:r>
-        <w:rPr>
-          <w:rStyle w:val="VerbatimChar"/>
-        </w:rPr>
-        <w:t xml:space="preserve">Your pattern: Don't lie outright. If I ask whether other candidates are still in the process, deflect once, then admit the pool has "narrowed." If I accept quickly, close warmly at $95,000. If I ask calm questions about the range and the timeline, show flexibility. If I bluff about other offers, probe gently.</w:t>
+        <w:t xml:space="preserve">Hidden: The other finalist withdrew yesterday. I'm the only candidate left. Your hiring manager approved up to $106,000. The role must be filled in three weeks or the budget gets reviewed. You also don't know whether I have other offers, and you're trying to find out.</w:t>
+      </w:r>
+      <w:r>
+        <w:br/>
+      </w:r>
+      <w:r>
+        <w:br/>
+      </w:r>
+      <w:r>
+        <w:rPr>
+          <w:rStyle w:val="VerbatimChar"/>
+        </w:rPr>
+        <w:t xml:space="preserve">Your pattern: Don't lie outright. If I ask whether other candidates are still in the process, deflect once, then admit the pool has "narrowed." If I accept quickly, close at $95,000. If I ask calm questions about the range and the timeline, show flexibility. If I bluff about other offers, probe gently.</w:t>
       </w:r>
       <w:r>
         <w:br/>
@@ -2380,19 +2356,19 @@
         <w:rPr>
           <w:rStyle w:val="VerbatimChar"/>
         </w:rPr>
-        <w:t xml:space="preserve">Hidden: Friday is quarter end and you need the deal for your target. A similar discount usually returns next quarter. The integration with my accounting software requires a paid add-on at $40 per month. You won't lie when asked a specific question. You stay vague when questions are vague.</w:t>
-      </w:r>
-      <w:r>
-        <w:br/>
-      </w:r>
-      <w:r>
-        <w:br/>
-      </w:r>
-      <w:r>
-        <w:rPr>
-          <w:rStyle w:val="VerbatimChar"/>
-        </w:rPr>
-        <w:t xml:space="preserve">Your pattern: Repeat the urgency if I sound hesitant. If I ask "would you say this to every client?" or ask for the deadline in writing, get slightly uncomfortable. If I ask exactly how the accounting integration works and what it costs, tell the truth. If I ask for a trial or a reference customer, agree.</w:t>
+        <w:t xml:space="preserve">Hidden: Friday is quarter end and you need the deal for your target. A similar discount returns next quarter. The integration with my accounting software requires a paid add-on at $40 per month. You answer specific questions truthfully and vague ones vaguely.</w:t>
+      </w:r>
+      <w:r>
+        <w:br/>
+      </w:r>
+      <w:r>
+        <w:br/>
+      </w:r>
+      <w:r>
+        <w:rPr>
+          <w:rStyle w:val="VerbatimChar"/>
+        </w:rPr>
+        <w:t xml:space="preserve">Your pattern: Repeat the urgency if I sound hesitant. If I ask "would you say this to every client?" or ask for the deadline in writing, get slightly uncomfortable. If I ask exactly how the accounting integration works and what it costs, tell the truth. </w:t>
       </w:r>
       <w:r>
         <w:br/>
@@ -2541,7 +2517,7 @@
         <w:rPr>
           <w:rStyle w:val="VerbatimChar"/>
         </w:rPr>
-        <w:t xml:space="preserve">Hidden: Your bonus isn't confirmed. Your manager said "probably." You also still owe another friend $600 from last year. You genuinely intend to repay me. You're embarrassed and you don't want to look unreliable. You won't lie if asked directly.</w:t>
+        <w:t xml:space="preserve">Hidden: Your bonus isn't confirmed. Your manager said "probably." You also still owe another friend $600 from last year. You intend to repay me. You don't want to look unreliable. You won't lie if asked directly.</w:t>
       </w:r>
       <w:r>
         <w:br/>
@@ -2720,7 +2696,7 @@
         <w:rPr>
           <w:rStyle w:val="VerbatimChar"/>
         </w:rPr>
-        <w:t xml:space="preserve">Your pattern: If I say "I really shouldn't, but okay," you thank me and mention another small idea. If I complain without changing anything, apologize and ask anyway. If I calmly state a policy and back it with a written change order, accept it without fuss and ask for the quote.</w:t>
+        <w:t xml:space="preserve">Your pattern: If I say "I really shouldn't, but okay," you thank me and mention another small idea. If I calmly state a policy and back it with a written change order, accept it without fuss and ask for the quote.</w:t>
       </w:r>
       <w:r>
         <w:br/>
@@ -2857,19 +2833,19 @@
         <w:rPr>
           <w:rStyle w:val="VerbatimChar"/>
         </w:rPr>
-        <w:t xml:space="preserve">Hidden: I've said "this is the last time" three times before. Each time I gave in. You don't believe me anymore. You also have a cheaper option: a friend offered you a ride but it's less convenient. You love me and don't mean harm. You've just learned my words carry no cost.</w:t>
-      </w:r>
-      <w:r>
-        <w:br/>
-      </w:r>
-      <w:r>
-        <w:br/>
-      </w:r>
-      <w:r>
-        <w:rPr>
-          <w:rStyle w:val="VerbatimChar"/>
-        </w:rPr>
-        <w:t xml:space="preserve">Your pattern: If I say "this is the last time," laugh it off gently and ask again. If I get angry, act hurt and say I'm overreacting. If I calmly name a specific condition I can actually enforce, like keeping the key until you show the tank was filled and the ticket paid, test it once. Then accept it if I hold steady.</w:t>
+        <w:t xml:space="preserve">Hidden: I've said "this is the last time" three times before. Each time I gave in. You don't believe me anymore. A friend offered you a ride but it's less convenient. You've just learned my words carry no cost.</w:t>
+      </w:r>
+      <w:r>
+        <w:br/>
+      </w:r>
+      <w:r>
+        <w:br/>
+      </w:r>
+      <w:r>
+        <w:rPr>
+          <w:rStyle w:val="VerbatimChar"/>
+        </w:rPr>
+        <w:t xml:space="preserve">Your pattern: If I say "this is the last time," laugh it off gently and ask again. If I get angry, act hurt and say I'm overreacting. If I calmly name a condition I can enforce, like no key until the ticket is paid, test it once. Then accept it if I hold steady.</w:t>
       </w:r>
       <w:r>
         <w:br/>
@@ -3012,31 +2988,31 @@
         <w:rPr>
           <w:rStyle w:val="VerbatimChar"/>
         </w:rPr>
-        <w:t xml:space="preserve">You are Helen. You're my next-door neighbor. We've been friendly for five years. I've come over to ask you to split the $2,000 cost of replacing our shared fence.</w:t>
-      </w:r>
-      <w:r>
-        <w:br/>
-      </w:r>
-      <w:r>
-        <w:br/>
-      </w:r>
-      <w:r>
-        <w:rPr>
-          <w:rStyle w:val="VerbatimChar"/>
-        </w:rPr>
-        <w:t xml:space="preserve">Hidden: You're selling your house in four months. You haven't told anyone on the street. A new fence adds little for you. Your relationship with me matters less now because you're leaving. You feel a bit guilty about that. You'd agree to a cheaper repair or a smaller share if asked fairly.</w:t>
-      </w:r>
-      <w:r>
-        <w:br/>
-      </w:r>
-      <w:r>
-        <w:br/>
-      </w:r>
-      <w:r>
-        <w:rPr>
-          <w:rStyle w:val="VerbatimChar"/>
-        </w:rPr>
-        <w:t xml:space="preserve">Your pattern: Be vague and say "let's wait until spring." If I appeal to our long friendship, agree warmly but commit to nothing. If I ask about your plans for the house or whether the timing is a problem, reveal the sale. If I propose a fair split that fits your short timeline, accept.</w:t>
+        <w:t xml:space="preserve">You are Helen. You're my next-door neighbor. I've come over to ask you to split the $2,000 cost of replacing our shared fence.</w:t>
+      </w:r>
+      <w:r>
+        <w:br/>
+      </w:r>
+      <w:r>
+        <w:br/>
+      </w:r>
+      <w:r>
+        <w:rPr>
+          <w:rStyle w:val="VerbatimChar"/>
+        </w:rPr>
+        <w:t xml:space="preserve">Hidden: You're selling your house in four months. You haven't told anyone on the street. A new fence adds little for you. Your relationship with me matters less now because you're leaving. You'd agree to a cheaper repair or a smaller share if asked fairly.</w:t>
+      </w:r>
+      <w:r>
+        <w:br/>
+      </w:r>
+      <w:r>
+        <w:br/>
+      </w:r>
+      <w:r>
+        <w:rPr>
+          <w:rStyle w:val="VerbatimChar"/>
+        </w:rPr>
+        <w:t xml:space="preserve">Your pattern: Be vague and say "let's wait until spring." If I appeal to our friendship, agree warmly but commit to nothing. If I ask about your plans for the house or whether the timing is a problem, reveal the sale. If I propose a fair split that fits your short timeline, accept.</w:t>
       </w:r>
       <w:r>
         <w:br/>
@@ -3185,7 +3161,7 @@
         <w:rPr>
           <w:rStyle w:val="VerbatimChar"/>
         </w:rPr>
-        <w:t xml:space="preserve">Your pattern: If I open with threats to switch suppliers, apologize and become guarded. If I assume you're exploiting us, get quieter. If I ask what happened on your side and on ours, explain the purchase order problem carefully. If I propose a joint fix, like a fixed ordering date, agree eagerly.</w:t>
+        <w:t xml:space="preserve">Your pattern: If I open with threats to switch suppliers, apologize and become guarded. If I ask what happened on your side and on ours, explain the purchase order problem carefully. If I propose a joint fix, like a fixed ordering date, agree eagerly.</w:t>
       </w:r>
       <w:r>
         <w:br/>
@@ -3332,7 +3308,7 @@
         <w:rPr>
           <w:rStyle w:val="VerbatimChar"/>
         </w:rPr>
-        <w:t xml:space="preserve">Hidden: You thought we agreed on pickup at your mother's house on Saturdays. I thought we agreed on the school parking lot. Neither of us wrote it down. You also started a new job with fixed Saturday shifts ending at 11 a.m. You assumed I knew. You aren't trying to make my life hard. You want the same smooth handoffs I want.</w:t>
+        <w:t xml:space="preserve">Hidden: You thought we agreed on pickup at your mother's house on Saturdays. I thought we agreed on the school parking lot. Neither of us wrote it down. You also started a new job with fixed Saturday shifts ending at 11 a.m. You assumed I knew. You want the same smooth handoffs I want.</w:t>
       </w:r>
       <w:r>
         <w:br/>
@@ -3469,31 +3445,31 @@
         <w:rPr>
           <w:rStyle w:val="VerbatimChar"/>
         </w:rPr>
-        <w:t xml:space="preserve">You are Tyler. You're a top sales rep. I'm your sales manager. I've asked to talk because you give 20 to 30 percent discounts in the last week of every month and our margins are suffering.</w:t>
-      </w:r>
-      <w:r>
-        <w:br/>
-      </w:r>
-      <w:r>
-        <w:br/>
-      </w:r>
-      <w:r>
-        <w:rPr>
-          <w:rStyle w:val="VerbatimChar"/>
-        </w:rPr>
-        <w:t xml:space="preserve">Hidden: Your commission is paid on revenue booked each month. Margin doesn't affect your pay at all. A month-end discount that closes a deal earns you more than holding price and losing it. You're not careless. You're responding sensibly to how you're paid. You'd happily protect margin if the plan rewarded it.</w:t>
-      </w:r>
-      <w:r>
-        <w:br/>
-      </w:r>
-      <w:r>
-        <w:br/>
-      </w:r>
-      <w:r>
-        <w:rPr>
-          <w:rStyle w:val="VerbatimChar"/>
-        </w:rPr>
-        <w:t xml:space="preserve">Your pattern: If I lecture you about margins, agree politely and keep doing it. If I threaten consequences, get defensive and point to your sales numbers. If I ask how your pay works or what would make holding price worth it to you, explain the commission plan frankly. If I suggest redesigning the incentive, help shape it.</w:t>
+        <w:t xml:space="preserve">You are Tyler. You're a top sales rep. I'm your manager. I've asked to talk because you give 20 to 30 percent discounts in the last week of every month and our margins are suffering.</w:t>
+      </w:r>
+      <w:r>
+        <w:br/>
+      </w:r>
+      <w:r>
+        <w:br/>
+      </w:r>
+      <w:r>
+        <w:rPr>
+          <w:rStyle w:val="VerbatimChar"/>
+        </w:rPr>
+        <w:t xml:space="preserve">Hidden: Your commission is paid on revenue booked each month. Margin doesn't affect your pay at all. A month-end discount that closes a deal earns you more than holding price and losing it. You're responding sensibly to how you're paid. You'd happily protect margin if the plan rewarded it.</w:t>
+      </w:r>
+      <w:r>
+        <w:br/>
+      </w:r>
+      <w:r>
+        <w:br/>
+      </w:r>
+      <w:r>
+        <w:rPr>
+          <w:rStyle w:val="VerbatimChar"/>
+        </w:rPr>
+        <w:t xml:space="preserve">Your pattern: If I lecture you about margins, agree politely and keep doing it. If I threaten, point to your sales numbers. If I ask how your pay works, explain the commission plan frankly. If I suggest redesigning the incentive, help shape it.</w:t>
       </w:r>
       <w:r>
         <w:br/>

</xml_diff>